<commit_message>
Strip color from the paper for an academic look
Converted the title, section headings, glossary/callout labels, figure
captions, and all four table borders/header shading from navy/light-blue
accents to black -- standard black-on-white styling for a finance/econ
working paper rather than a colored report look. No text content changed.

Co-Authored-By: Claude Sonnet 5 <noreply@anthropic.com>
</commit_message>
<xml_diff>
--- a/paper/TSXV_Liquidity_Puzzle_PlainEnglish.docx
+++ b/paper/TSXV_Liquidity_Puzzle_PlainEnglish.docx
@@ -12,7 +12,7 @@
         <w:rPr>
           <w:b w:val="1"/>
           <w:bCs w:val="1"/>
-          <w:color w:val="1f3a5f"/>
+          <w:color w:val="000000"/>
           <w:sz w:val="42"/>
           <w:szCs w:val="42"/>
           <w:rtl w:val="0"/>
@@ -179,7 +179,7 @@
         <w:rPr>
           <w:b w:val="1"/>
           <w:bCs w:val="1"/>
-          <w:color w:val="1f3a5f"/>
+          <w:color w:val="000000"/>
           <w:rtl w:val="0"/>
         </w:rPr>
         <w:t xml:space="preserve">Liquid / illiquid — </w:t>
@@ -201,7 +201,7 @@
         <w:rPr>
           <w:b w:val="1"/>
           <w:bCs w:val="1"/>
-          <w:color w:val="1f3a5f"/>
+          <w:color w:val="000000"/>
           <w:rtl w:val="0"/>
         </w:rPr>
         <w:t xml:space="preserve">Excess return — </w:t>
@@ -223,7 +223,7 @@
         <w:rPr>
           <w:b w:val="1"/>
           <w:bCs w:val="1"/>
-          <w:color w:val="1f3a5f"/>
+          <w:color w:val="000000"/>
           <w:rtl w:val="0"/>
         </w:rPr>
         <w:t xml:space="preserve">The benchmark — </w:t>
@@ -245,7 +245,7 @@
         <w:rPr>
           <w:b w:val="1"/>
           <w:bCs w:val="1"/>
-          <w:color w:val="1f3a5f"/>
+          <w:color w:val="000000"/>
           <w:rtl w:val="0"/>
         </w:rPr>
         <w:t xml:space="preserve">Quintile — </w:t>
@@ -267,7 +267,7 @@
         <w:rPr>
           <w:b w:val="1"/>
           <w:bCs w:val="1"/>
-          <w:color w:val="1f3a5f"/>
+          <w:color w:val="000000"/>
           <w:rtl w:val="0"/>
         </w:rPr>
         <w:t xml:space="preserve">“Q5 minus Q1” / the spread — </w:t>
@@ -289,7 +289,7 @@
         <w:rPr>
           <w:b w:val="1"/>
           <w:bCs w:val="1"/>
-          <w:color w:val="1f3a5f"/>
+          <w:color w:val="000000"/>
           <w:rtl w:val="0"/>
         </w:rPr>
         <w:t xml:space="preserve">Median vs. average (mean) — </w:t>
@@ -311,7 +311,7 @@
         <w:rPr>
           <w:b w:val="1"/>
           <w:bCs w:val="1"/>
-          <w:color w:val="1f3a5f"/>
+          <w:color w:val="000000"/>
           <w:rtl w:val="0"/>
         </w:rPr>
         <w:t xml:space="preserve">Statistical significance / t-statistic — </w:t>
@@ -333,7 +333,7 @@
         <w:rPr>
           <w:b w:val="1"/>
           <w:bCs w:val="1"/>
-          <w:color w:val="1f3a5f"/>
+          <w:color w:val="000000"/>
           <w:rtl w:val="0"/>
         </w:rPr>
         <w:t xml:space="preserve">Out-of-sample test / holdout — </w:t>
@@ -355,7 +355,7 @@
         <w:rPr>
           <w:b w:val="1"/>
           <w:bCs w:val="1"/>
-          <w:color w:val="1f3a5f"/>
+          <w:color w:val="000000"/>
           <w:rtl w:val="0"/>
         </w:rPr>
         <w:t xml:space="preserve">Winsorizing — </w:t>
@@ -377,7 +377,7 @@
         <w:rPr>
           <w:b w:val="1"/>
           <w:bCs w:val="1"/>
-          <w:color w:val="1f3a5f"/>
+          <w:color w:val="000000"/>
           <w:rtl w:val="0"/>
         </w:rPr>
         <w:t xml:space="preserve">Survivorship bias — </w:t>
@@ -420,7 +420,7 @@
         <w:rPr>
           <w:b w:val="1"/>
           <w:bCs w:val="1"/>
-          <w:color w:val="1f3a5f"/>
+          <w:color w:val="000000"/>
           <w:rtl w:val="0"/>
         </w:rPr>
         <w:t xml:space="preserve">Measure 1 — the Amihud ratio — </w:t>
@@ -442,7 +442,7 @@
         <w:rPr>
           <w:b w:val="1"/>
           <w:bCs w:val="1"/>
-          <w:color w:val="1f3a5f"/>
+          <w:color w:val="000000"/>
           <w:rtl w:val="0"/>
         </w:rPr>
         <w:t xml:space="preserve">Measure 2 — zero-return days — </w:t>
@@ -464,7 +464,7 @@
         <w:rPr>
           <w:b w:val="1"/>
           <w:bCs w:val="1"/>
-          <w:color w:val="1f3a5f"/>
+          <w:color w:val="000000"/>
           <w:rtl w:val="0"/>
         </w:rPr>
         <w:t xml:space="preserve">Measure 3 — the Corwin-Schultz spread — </w:t>
@@ -1878,7 +1878,7 @@
         <w:rPr>
           <w:i w:val="1"/>
           <w:iCs w:val="1"/>
-          <w:color w:val="555555"/>
+          <w:color w:val="000000"/>
           <w:sz w:val="18"/>
           <w:szCs w:val="18"/>
           <w:rtl w:val="0"/>
@@ -2022,7 +2022,7 @@
         <w:rPr>
           <w:i w:val="1"/>
           <w:iCs w:val="1"/>
-          <w:color w:val="555555"/>
+          <w:color w:val="000000"/>
           <w:sz w:val="18"/>
           <w:szCs w:val="18"/>
           <w:rtl w:val="0"/>
@@ -2221,7 +2221,7 @@
         <w:rPr>
           <w:i w:val="1"/>
           <w:iCs w:val="1"/>
-          <w:color w:val="555555"/>
+          <w:color w:val="000000"/>
           <w:sz w:val="18"/>
           <w:szCs w:val="18"/>
           <w:rtl w:val="0"/>
@@ -3360,7 +3360,7 @@
         <w:rPr>
           <w:i w:val="1"/>
           <w:iCs w:val="1"/>
-          <w:color w:val="555555"/>
+          <w:color w:val="000000"/>
           <w:sz w:val="18"/>
           <w:szCs w:val="18"/>
           <w:rtl w:val="0"/>
@@ -4948,7 +4948,7 @@
         <w:rPr>
           <w:i w:val="1"/>
           <w:iCs w:val="1"/>
-          <w:color w:val="555555"/>
+          <w:color w:val="000000"/>
           <w:sz w:val="18"/>
           <w:szCs w:val="18"/>
           <w:rtl w:val="0"/>
@@ -5481,7 +5481,7 @@
         <w:rPr>
           <w:i w:val="1"/>
           <w:iCs w:val="1"/>
-          <w:color w:val="555555"/>
+          <w:color w:val="000000"/>
           <w:sz w:val="18"/>
           <w:szCs w:val="18"/>
           <w:rtl w:val="0"/>
@@ -5550,7 +5550,7 @@
         <w:rPr>
           <w:i w:val="1"/>
           <w:iCs w:val="1"/>
-          <w:color w:val="555555"/>
+          <w:color w:val="000000"/>
           <w:sz w:val="18"/>
           <w:szCs w:val="18"/>
           <w:rtl w:val="0"/>
@@ -7834,7 +7834,7 @@
       <w:rFonts w:ascii="Calibri" w:cs="Calibri" w:eastAsia="Calibri" w:hAnsi="Calibri"/>
       <w:b w:val="1"/>
       <w:bCs w:val="1"/>
-      <w:color w:val="366091"/>
+      <w:color w:val="000000"/>
       <w:sz w:val="28"/>
       <w:szCs w:val="28"/>
     </w:rPr>
@@ -7852,7 +7852,7 @@
       <w:rFonts w:ascii="Calibri" w:cs="Calibri" w:eastAsia="Calibri" w:hAnsi="Calibri"/>
       <w:b w:val="1"/>
       <w:bCs w:val="1"/>
-      <w:color w:val="4f81bd"/>
+      <w:color w:val="000000"/>
       <w:sz w:val="26"/>
       <w:szCs w:val="26"/>
     </w:rPr>
@@ -7870,7 +7870,7 @@
       <w:rFonts w:ascii="Calibri" w:cs="Calibri" w:eastAsia="Calibri" w:hAnsi="Calibri"/>
       <w:b w:val="1"/>
       <w:bCs w:val="1"/>
-      <w:color w:val="4f81bd"/>
+      <w:color w:val="000000"/>
     </w:rPr>
   </w:style>
   <w:style w:type="paragraph" w:styleId="Heading4">
@@ -7888,7 +7888,7 @@
       <w:bCs w:val="1"/>
       <w:i w:val="1"/>
       <w:iCs w:val="1"/>
-      <w:color w:val="4f81bd"/>
+      <w:color w:val="000000"/>
     </w:rPr>
   </w:style>
   <w:style w:type="paragraph" w:styleId="Heading5">
@@ -7927,7 +7927,7 @@
     <w:next w:val="Normal"/>
     <w:pPr>
       <w:pBdr>
-        <w:bottom w:color="4f81bd" w:space="4" w:sz="8" w:val="single"/>
+        <w:bottom w:color="000000" w:space="4" w:sz="8" w:val="single"/>
       </w:pBdr>
       <w:spacing w:after="300" w:line="240" w:lineRule="auto"/>
     </w:pPr>
@@ -8023,7 +8023,7 @@
     </w:pPr>
     <w:rPr>
       <w:rFonts w:asciiTheme="majorHAnsi" w:cstheme="majorBidi" w:eastAsiaTheme="majorEastAsia" w:hAnsiTheme="majorHAnsi"/>
-      <w:color w:val="4f81bd" w:themeColor="accent1"/>
+      <w:color w:val="000000" w:themeColor="accent1"/>
       <w:sz w:val="20"/>
       <w:szCs w:val="20"/>
     </w:rPr>
@@ -8114,7 +8114,7 @@
       <w:rFonts w:asciiTheme="majorHAnsi" w:cstheme="majorBidi" w:eastAsiaTheme="majorEastAsia" w:hAnsiTheme="majorHAnsi"/>
       <w:b w:val="1"/>
       <w:bCs w:val="1"/>
-      <w:color w:val="4f81bd" w:themeColor="accent1"/>
+      <w:color w:val="000000" w:themeColor="accent1"/>
       <w:sz w:val="26"/>
       <w:szCs w:val="26"/>
     </w:rPr>
@@ -8129,7 +8129,7 @@
       <w:rFonts w:asciiTheme="majorHAnsi" w:cstheme="majorBidi" w:eastAsiaTheme="majorEastAsia" w:hAnsiTheme="majorHAnsi"/>
       <w:b w:val="1"/>
       <w:bCs w:val="1"/>
-      <w:color w:val="4f81bd" w:themeColor="accent1"/>
+      <w:color w:val="000000" w:themeColor="accent1"/>
     </w:rPr>
   </w:style>
   <w:style w:type="character" w:styleId="TitleChar" w:customStyle="1">
@@ -8157,7 +8157,7 @@
       <w:rFonts w:asciiTheme="majorHAnsi" w:cstheme="majorBidi" w:eastAsiaTheme="majorEastAsia" w:hAnsiTheme="majorHAnsi"/>
       <w:i w:val="1"/>
       <w:iCs w:val="1"/>
-      <w:color w:val="4f81bd" w:themeColor="accent1"/>
+      <w:color w:val="000000" w:themeColor="accent1"/>
       <w:spacing w:val="15"/>
       <w:sz w:val="24"/>
       <w:szCs w:val="24"/>
@@ -8457,7 +8457,7 @@
       <w:bCs w:val="1"/>
       <w:i w:val="1"/>
       <w:iCs w:val="1"/>
-      <w:color w:val="4f81bd" w:themeColor="accent1"/>
+      <w:color w:val="000000" w:themeColor="accent1"/>
     </w:rPr>
   </w:style>
   <w:style w:type="character" w:styleId="Heading5Char" w:customStyle="1">
@@ -8509,7 +8509,7 @@
     <w:rsid w:val="00FC693F"/>
     <w:rPr>
       <w:rFonts w:asciiTheme="majorHAnsi" w:cstheme="majorBidi" w:eastAsiaTheme="majorEastAsia" w:hAnsiTheme="majorHAnsi"/>
-      <w:color w:val="4f81bd" w:themeColor="accent1"/>
+      <w:color w:val="000000" w:themeColor="accent1"/>
       <w:sz w:val="20"/>
       <w:szCs w:val="20"/>
     </w:rPr>
@@ -8545,7 +8545,7 @@
     <w:rPr>
       <w:b w:val="1"/>
       <w:bCs w:val="1"/>
-      <w:color w:val="4f81bd" w:themeColor="accent1"/>
+      <w:color w:val="000000" w:themeColor="accent1"/>
       <w:sz w:val="18"/>
       <w:szCs w:val="18"/>
     </w:rPr>
@@ -8582,7 +8582,7 @@
     <w:rsid w:val="00FC693F"/>
     <w:pPr>
       <w:pBdr>
-        <w:bottom w:color="4f81bd" w:space="4" w:sz="4" w:themeColor="accent1" w:val="single"/>
+        <w:bottom w:color="000000" w:space="4" w:sz="4" w:themeColor="accent1" w:val="single"/>
       </w:pBdr>
       <w:spacing w:after="280" w:before="200"/>
       <w:ind w:left="936" w:right="936"/>
@@ -8592,7 +8592,7 @@
       <w:bCs w:val="1"/>
       <w:i w:val="1"/>
       <w:iCs w:val="1"/>
-      <w:color w:val="4f81bd" w:themeColor="accent1"/>
+      <w:color w:val="000000" w:themeColor="accent1"/>
     </w:rPr>
   </w:style>
   <w:style w:type="character" w:styleId="IntenseQuoteChar" w:customStyle="1">
@@ -8606,7 +8606,7 @@
       <w:bCs w:val="1"/>
       <w:i w:val="1"/>
       <w:iCs w:val="1"/>
-      <w:color w:val="4f81bd" w:themeColor="accent1"/>
+      <w:color w:val="000000" w:themeColor="accent1"/>
     </w:rPr>
   </w:style>
   <w:style w:type="character" w:styleId="SubtleEmphasis">
@@ -8632,7 +8632,7 @@
       <w:bCs w:val="1"/>
       <w:i w:val="1"/>
       <w:iCs w:val="1"/>
-      <w:color w:val="4f81bd" w:themeColor="accent1"/>
+      <w:color w:val="000000" w:themeColor="accent1"/>
     </w:rPr>
   </w:style>
   <w:style w:type="character" w:styleId="SubtleReference">
@@ -8833,8 +8833,8 @@
       <w:tblStyleColBandSize w:val="1"/>
       <w:tblInd w:w="0.0" w:type="dxa"/>
       <w:tblBorders>
-        <w:top w:color="4f81bd" w:space="0" w:sz="8" w:themeColor="accent1" w:val="single"/>
-        <w:bottom w:color="4f81bd" w:space="0" w:sz="8" w:themeColor="accent1" w:val="single"/>
+        <w:top w:color="000000" w:space="0" w:sz="8" w:themeColor="accent1" w:val="single"/>
+        <w:bottom w:color="000000" w:space="0" w:sz="8" w:themeColor="accent1" w:val="single"/>
       </w:tblBorders>
       <w:tblCellMar>
         <w:top w:w="0.0" w:type="dxa"/>
@@ -8854,9 +8854,9 @@
       <w:tblPr/>
       <w:tcPr>
         <w:tcBorders>
-          <w:top w:color="4f81bd" w:space="0" w:sz="8" w:themeColor="accent1" w:val="single"/>
-          <w:left w:space="0" w:sz="0" w:val="nil"/>
-          <w:bottom w:color="4f81bd" w:space="0" w:sz="8" w:themeColor="accent1" w:val="single"/>
+          <w:top w:color="000000" w:space="0" w:sz="8" w:themeColor="accent1" w:val="single"/>
+          <w:left w:space="0" w:sz="0" w:val="nil"/>
+          <w:bottom w:color="000000" w:space="0" w:sz="8" w:themeColor="accent1" w:val="single"/>
           <w:right w:space="0" w:sz="0" w:val="nil"/>
           <w:insideH w:space="0" w:sz="0" w:val="nil"/>
           <w:insideV w:space="0" w:sz="0" w:val="nil"/>
@@ -8874,9 +8874,9 @@
       <w:tblPr/>
       <w:tcPr>
         <w:tcBorders>
-          <w:top w:color="4f81bd" w:space="0" w:sz="8" w:themeColor="accent1" w:val="single"/>
-          <w:left w:space="0" w:sz="0" w:val="nil"/>
-          <w:bottom w:color="4f81bd" w:space="0" w:sz="8" w:themeColor="accent1" w:val="single"/>
+          <w:top w:color="000000" w:space="0" w:sz="8" w:themeColor="accent1" w:val="single"/>
+          <w:left w:space="0" w:sz="0" w:val="nil"/>
+          <w:bottom w:color="000000" w:space="0" w:sz="8" w:themeColor="accent1" w:val="single"/>
           <w:right w:space="0" w:sz="0" w:val="nil"/>
           <w:insideH w:space="0" w:sz="0" w:val="nil"/>
           <w:insideV w:space="0" w:sz="0" w:val="nil"/>
@@ -8904,7 +8904,7 @@
           <w:insideH w:space="0" w:sz="0" w:val="nil"/>
           <w:insideV w:space="0" w:sz="0" w:val="nil"/>
         </w:tcBorders>
-        <w:shd w:color="auto" w:fill="d3dfee" w:themeFill="accent1" w:themeFillTint="00003F" w:val="clear"/>
+        <w:shd w:color="auto" w:fill="FFFFFF" w:themeFill="accent1" w:themeFillTint="00003F" w:val="clear"/>
       </w:tcPr>
     </w:tblStylePr>
     <w:tblStylePr w:type="band1Horz">
@@ -8916,7 +8916,7 @@
           <w:insideH w:space="0" w:sz="0" w:val="nil"/>
           <w:insideV w:space="0" w:sz="0" w:val="nil"/>
         </w:tcBorders>
-        <w:shd w:color="auto" w:fill="d3dfee" w:themeFill="accent1" w:themeFillTint="00003F" w:val="clear"/>
+        <w:shd w:color="auto" w:fill="FFFFFF" w:themeFill="accent1" w:themeFillTint="00003F" w:val="clear"/>
       </w:tcPr>
     </w:tblStylePr>
   </w:style>
@@ -9540,10 +9540,10 @@
       <w:tblStyleColBandSize w:val="1"/>
       <w:tblInd w:w="0.0" w:type="dxa"/>
       <w:tblBorders>
-        <w:top w:color="4f81bd" w:space="0" w:sz="8" w:themeColor="accent1" w:val="single"/>
-        <w:left w:color="4f81bd" w:space="0" w:sz="8" w:themeColor="accent1" w:val="single"/>
-        <w:bottom w:color="4f81bd" w:space="0" w:sz="8" w:themeColor="accent1" w:val="single"/>
-        <w:right w:color="4f81bd" w:space="0" w:sz="8" w:themeColor="accent1" w:val="single"/>
+        <w:top w:color="000000" w:space="0" w:sz="8" w:themeColor="accent1" w:val="single"/>
+        <w:left w:color="000000" w:space="0" w:sz="8" w:themeColor="accent1" w:val="single"/>
+        <w:bottom w:color="000000" w:space="0" w:sz="8" w:themeColor="accent1" w:val="single"/>
+        <w:right w:color="000000" w:space="0" w:sz="8" w:themeColor="accent1" w:val="single"/>
       </w:tblBorders>
       <w:tblCellMar>
         <w:top w:w="0.0" w:type="dxa"/>
@@ -9563,7 +9563,7 @@
       </w:rPr>
       <w:tblPr/>
       <w:tcPr>
-        <w:shd w:color="auto" w:fill="4f81bd" w:themeFill="accent1" w:val="clear"/>
+        <w:shd w:color="auto" w:fill="000000" w:themeFill="accent1" w:val="clear"/>
       </w:tcPr>
     </w:tblStylePr>
     <w:tblStylePr w:type="lastRow">
@@ -9577,10 +9577,10 @@
       <w:tblPr/>
       <w:tcPr>
         <w:tcBorders>
-          <w:top w:color="4f81bd" w:space="0" w:sz="6" w:themeColor="accent1" w:val="double"/>
-          <w:left w:color="4f81bd" w:space="0" w:sz="8" w:themeColor="accent1" w:val="single"/>
-          <w:bottom w:color="4f81bd" w:space="0" w:sz="8" w:themeColor="accent1" w:val="single"/>
-          <w:right w:color="4f81bd" w:space="0" w:sz="8" w:themeColor="accent1" w:val="single"/>
+          <w:top w:color="000000" w:space="0" w:sz="6" w:themeColor="accent1" w:val="double"/>
+          <w:left w:color="000000" w:space="0" w:sz="8" w:themeColor="accent1" w:val="single"/>
+          <w:bottom w:color="000000" w:space="0" w:sz="8" w:themeColor="accent1" w:val="single"/>
+          <w:right w:color="000000" w:space="0" w:sz="8" w:themeColor="accent1" w:val="single"/>
         </w:tcBorders>
       </w:tcPr>
     </w:tblStylePr>
@@ -9600,10 +9600,10 @@
       <w:tblPr/>
       <w:tcPr>
         <w:tcBorders>
-          <w:top w:color="4f81bd" w:space="0" w:sz="8" w:themeColor="accent1" w:val="single"/>
-          <w:left w:color="4f81bd" w:space="0" w:sz="8" w:themeColor="accent1" w:val="single"/>
-          <w:bottom w:color="4f81bd" w:space="0" w:sz="8" w:themeColor="accent1" w:val="single"/>
-          <w:right w:color="4f81bd" w:space="0" w:sz="8" w:themeColor="accent1" w:val="single"/>
+          <w:top w:color="000000" w:space="0" w:sz="8" w:themeColor="accent1" w:val="single"/>
+          <w:left w:color="000000" w:space="0" w:sz="8" w:themeColor="accent1" w:val="single"/>
+          <w:bottom w:color="000000" w:space="0" w:sz="8" w:themeColor="accent1" w:val="single"/>
+          <w:right w:color="000000" w:space="0" w:sz="8" w:themeColor="accent1" w:val="single"/>
         </w:tcBorders>
       </w:tcPr>
     </w:tblStylePr>
@@ -9611,10 +9611,10 @@
       <w:tblPr/>
       <w:tcPr>
         <w:tcBorders>
-          <w:top w:color="4f81bd" w:space="0" w:sz="8" w:themeColor="accent1" w:val="single"/>
-          <w:left w:color="4f81bd" w:space="0" w:sz="8" w:themeColor="accent1" w:val="single"/>
-          <w:bottom w:color="4f81bd" w:space="0" w:sz="8" w:themeColor="accent1" w:val="single"/>
-          <w:right w:color="4f81bd" w:space="0" w:sz="8" w:themeColor="accent1" w:val="single"/>
+          <w:top w:color="000000" w:space="0" w:sz="8" w:themeColor="accent1" w:val="single"/>
+          <w:left w:color="000000" w:space="0" w:sz="8" w:themeColor="accent1" w:val="single"/>
+          <w:bottom w:color="000000" w:space="0" w:sz="8" w:themeColor="accent1" w:val="single"/>
+          <w:right w:color="000000" w:space="0" w:sz="8" w:themeColor="accent1" w:val="single"/>
         </w:tcBorders>
       </w:tcPr>
     </w:tblStylePr>
@@ -10222,12 +10222,12 @@
       <w:tblStyleColBandSize w:val="1"/>
       <w:tblInd w:w="0.0" w:type="dxa"/>
       <w:tblBorders>
-        <w:top w:color="4f81bd" w:space="0" w:sz="8" w:themeColor="accent1" w:val="single"/>
-        <w:left w:color="4f81bd" w:space="0" w:sz="8" w:themeColor="accent1" w:val="single"/>
-        <w:bottom w:color="4f81bd" w:space="0" w:sz="8" w:themeColor="accent1" w:val="single"/>
-        <w:right w:color="4f81bd" w:space="0" w:sz="8" w:themeColor="accent1" w:val="single"/>
-        <w:insideH w:color="4f81bd" w:space="0" w:sz="8" w:themeColor="accent1" w:val="single"/>
-        <w:insideV w:color="4f81bd" w:space="0" w:sz="8" w:themeColor="accent1" w:val="single"/>
+        <w:top w:color="000000" w:space="0" w:sz="8" w:themeColor="accent1" w:val="single"/>
+        <w:left w:color="000000" w:space="0" w:sz="8" w:themeColor="accent1" w:val="single"/>
+        <w:bottom w:color="000000" w:space="0" w:sz="8" w:themeColor="accent1" w:val="single"/>
+        <w:right w:color="000000" w:space="0" w:sz="8" w:themeColor="accent1" w:val="single"/>
+        <w:insideH w:color="000000" w:space="0" w:sz="8" w:themeColor="accent1" w:val="single"/>
+        <w:insideV w:color="000000" w:space="0" w:sz="8" w:themeColor="accent1" w:val="single"/>
       </w:tblBorders>
       <w:tblCellMar>
         <w:top w:w="0.0" w:type="dxa"/>
@@ -10248,12 +10248,12 @@
       <w:tblPr/>
       <w:tcPr>
         <w:tcBorders>
-          <w:top w:color="4f81bd" w:space="0" w:sz="8" w:themeColor="accent1" w:val="single"/>
-          <w:left w:color="4f81bd" w:space="0" w:sz="8" w:themeColor="accent1" w:val="single"/>
-          <w:bottom w:color="4f81bd" w:space="0" w:sz="18" w:themeColor="accent1" w:val="single"/>
-          <w:right w:color="4f81bd" w:space="0" w:sz="8" w:themeColor="accent1" w:val="single"/>
-          <w:insideH w:space="0" w:sz="0" w:val="nil"/>
-          <w:insideV w:color="4f81bd" w:space="0" w:sz="8" w:themeColor="accent1" w:val="single"/>
+          <w:top w:color="000000" w:space="0" w:sz="8" w:themeColor="accent1" w:val="single"/>
+          <w:left w:color="000000" w:space="0" w:sz="8" w:themeColor="accent1" w:val="single"/>
+          <w:bottom w:color="000000" w:space="0" w:sz="18" w:themeColor="accent1" w:val="single"/>
+          <w:right w:color="000000" w:space="0" w:sz="8" w:themeColor="accent1" w:val="single"/>
+          <w:insideH w:space="0" w:sz="0" w:val="nil"/>
+          <w:insideV w:color="000000" w:space="0" w:sz="8" w:themeColor="accent1" w:val="single"/>
         </w:tcBorders>
       </w:tcPr>
     </w:tblStylePr>
@@ -10269,12 +10269,12 @@
       <w:tblPr/>
       <w:tcPr>
         <w:tcBorders>
-          <w:top w:color="4f81bd" w:space="0" w:sz="6" w:themeColor="accent1" w:val="double"/>
-          <w:left w:color="4f81bd" w:space="0" w:sz="8" w:themeColor="accent1" w:val="single"/>
-          <w:bottom w:color="4f81bd" w:space="0" w:sz="8" w:themeColor="accent1" w:val="single"/>
-          <w:right w:color="4f81bd" w:space="0" w:sz="8" w:themeColor="accent1" w:val="single"/>
-          <w:insideH w:space="0" w:sz="0" w:val="nil"/>
-          <w:insideV w:color="4f81bd" w:space="0" w:sz="8" w:themeColor="accent1" w:val="single"/>
+          <w:top w:color="000000" w:space="0" w:sz="6" w:themeColor="accent1" w:val="double"/>
+          <w:left w:color="000000" w:space="0" w:sz="8" w:themeColor="accent1" w:val="single"/>
+          <w:bottom w:color="000000" w:space="0" w:sz="8" w:themeColor="accent1" w:val="single"/>
+          <w:right w:color="000000" w:space="0" w:sz="8" w:themeColor="accent1" w:val="single"/>
+          <w:insideH w:space="0" w:sz="0" w:val="nil"/>
+          <w:insideV w:color="000000" w:space="0" w:sz="8" w:themeColor="accent1" w:val="single"/>
         </w:tcBorders>
       </w:tcPr>
     </w:tblStylePr>
@@ -10294,10 +10294,10 @@
       <w:tblPr/>
       <w:tcPr>
         <w:tcBorders>
-          <w:top w:color="4f81bd" w:space="0" w:sz="8" w:themeColor="accent1" w:val="single"/>
-          <w:left w:color="4f81bd" w:space="0" w:sz="8" w:themeColor="accent1" w:val="single"/>
-          <w:bottom w:color="4f81bd" w:space="0" w:sz="8" w:themeColor="accent1" w:val="single"/>
-          <w:right w:color="4f81bd" w:space="0" w:sz="8" w:themeColor="accent1" w:val="single"/>
+          <w:top w:color="000000" w:space="0" w:sz="8" w:themeColor="accent1" w:val="single"/>
+          <w:left w:color="000000" w:space="0" w:sz="8" w:themeColor="accent1" w:val="single"/>
+          <w:bottom w:color="000000" w:space="0" w:sz="8" w:themeColor="accent1" w:val="single"/>
+          <w:right w:color="000000" w:space="0" w:sz="8" w:themeColor="accent1" w:val="single"/>
         </w:tcBorders>
       </w:tcPr>
     </w:tblStylePr>
@@ -10305,36 +10305,36 @@
       <w:tblPr/>
       <w:tcPr>
         <w:tcBorders>
-          <w:top w:color="4f81bd" w:space="0" w:sz="8" w:themeColor="accent1" w:val="single"/>
-          <w:left w:color="4f81bd" w:space="0" w:sz="8" w:themeColor="accent1" w:val="single"/>
-          <w:bottom w:color="4f81bd" w:space="0" w:sz="8" w:themeColor="accent1" w:val="single"/>
-          <w:right w:color="4f81bd" w:space="0" w:sz="8" w:themeColor="accent1" w:val="single"/>
-        </w:tcBorders>
-        <w:shd w:color="auto" w:fill="d3dfee" w:themeFill="accent1" w:themeFillTint="00003F" w:val="clear"/>
+          <w:top w:color="000000" w:space="0" w:sz="8" w:themeColor="accent1" w:val="single"/>
+          <w:left w:color="000000" w:space="0" w:sz="8" w:themeColor="accent1" w:val="single"/>
+          <w:bottom w:color="000000" w:space="0" w:sz="8" w:themeColor="accent1" w:val="single"/>
+          <w:right w:color="000000" w:space="0" w:sz="8" w:themeColor="accent1" w:val="single"/>
+        </w:tcBorders>
+        <w:shd w:color="auto" w:fill="FFFFFF" w:themeFill="accent1" w:themeFillTint="00003F" w:val="clear"/>
       </w:tcPr>
     </w:tblStylePr>
     <w:tblStylePr w:type="band1Horz">
       <w:tblPr/>
       <w:tcPr>
         <w:tcBorders>
-          <w:top w:color="4f81bd" w:space="0" w:sz="8" w:themeColor="accent1" w:val="single"/>
-          <w:left w:color="4f81bd" w:space="0" w:sz="8" w:themeColor="accent1" w:val="single"/>
-          <w:bottom w:color="4f81bd" w:space="0" w:sz="8" w:themeColor="accent1" w:val="single"/>
-          <w:right w:color="4f81bd" w:space="0" w:sz="8" w:themeColor="accent1" w:val="single"/>
-          <w:insideV w:color="4f81bd" w:space="0" w:sz="8" w:themeColor="accent1" w:val="single"/>
-        </w:tcBorders>
-        <w:shd w:color="auto" w:fill="d3dfee" w:themeFill="accent1" w:themeFillTint="00003F" w:val="clear"/>
+          <w:top w:color="000000" w:space="0" w:sz="8" w:themeColor="accent1" w:val="single"/>
+          <w:left w:color="000000" w:space="0" w:sz="8" w:themeColor="accent1" w:val="single"/>
+          <w:bottom w:color="000000" w:space="0" w:sz="8" w:themeColor="accent1" w:val="single"/>
+          <w:right w:color="000000" w:space="0" w:sz="8" w:themeColor="accent1" w:val="single"/>
+          <w:insideV w:color="000000" w:space="0" w:sz="8" w:themeColor="accent1" w:val="single"/>
+        </w:tcBorders>
+        <w:shd w:color="auto" w:fill="FFFFFF" w:themeFill="accent1" w:themeFillTint="00003F" w:val="clear"/>
       </w:tcPr>
     </w:tblStylePr>
     <w:tblStylePr w:type="band2Horz">
       <w:tblPr/>
       <w:tcPr>
         <w:tcBorders>
-          <w:top w:color="4f81bd" w:space="0" w:sz="8" w:themeColor="accent1" w:val="single"/>
-          <w:left w:color="4f81bd" w:space="0" w:sz="8" w:themeColor="accent1" w:val="single"/>
-          <w:bottom w:color="4f81bd" w:space="0" w:sz="8" w:themeColor="accent1" w:val="single"/>
-          <w:right w:color="4f81bd" w:space="0" w:sz="8" w:themeColor="accent1" w:val="single"/>
-          <w:insideV w:color="4f81bd" w:space="0" w:sz="8" w:themeColor="accent1" w:val="single"/>
+          <w:top w:color="000000" w:space="0" w:sz="8" w:themeColor="accent1" w:val="single"/>
+          <w:left w:color="000000" w:space="0" w:sz="8" w:themeColor="accent1" w:val="single"/>
+          <w:bottom w:color="000000" w:space="0" w:sz="8" w:themeColor="accent1" w:val="single"/>
+          <w:right w:color="000000" w:space="0" w:sz="8" w:themeColor="accent1" w:val="single"/>
+          <w:insideV w:color="000000" w:space="0" w:sz="8" w:themeColor="accent1" w:val="single"/>
         </w:tcBorders>
       </w:tcPr>
     </w:tblStylePr>
@@ -11140,7 +11140,7 @@
           <w:insideH w:space="0" w:sz="0" w:val="nil"/>
           <w:insideV w:space="0" w:sz="0" w:val="nil"/>
         </w:tcBorders>
-        <w:shd w:color="auto" w:fill="4f81bd" w:themeFill="accent1" w:val="clear"/>
+        <w:shd w:color="auto" w:fill="000000" w:themeFill="accent1" w:val="clear"/>
       </w:tcPr>
     </w:tblStylePr>
     <w:tblStylePr w:type="lastRow">
@@ -11178,7 +11178,7 @@
     <w:tblStylePr w:type="band1Vert">
       <w:tblPr/>
       <w:tcPr>
-        <w:shd w:color="auto" w:fill="d3dfee" w:themeFill="accent1" w:themeFillTint="00003F" w:val="clear"/>
+        <w:shd w:color="auto" w:fill="FFFFFF" w:themeFill="accent1" w:themeFillTint="00003F" w:val="clear"/>
       </w:tcPr>
     </w:tblStylePr>
     <w:tblStylePr w:type="band1Horz">
@@ -11188,7 +11188,7 @@
           <w:insideH w:space="0" w:sz="0" w:val="nil"/>
           <w:insideV w:space="0" w:sz="0" w:val="nil"/>
         </w:tcBorders>
-        <w:shd w:color="auto" w:fill="d3dfee" w:themeFill="accent1" w:themeFillTint="00003F" w:val="clear"/>
+        <w:shd w:color="auto" w:fill="FFFFFF" w:themeFill="accent1" w:themeFillTint="00003F" w:val="clear"/>
       </w:tcPr>
     </w:tblStylePr>
     <w:tblStylePr w:type="band2Horz">
@@ -11922,7 +11922,7 @@
           <w:insideH w:space="0" w:sz="0" w:val="nil"/>
           <w:insideV w:space="0" w:sz="0" w:val="nil"/>
         </w:tcBorders>
-        <w:shd w:color="auto" w:fill="4f81bd" w:themeFill="accent1" w:val="clear"/>
+        <w:shd w:color="auto" w:fill="000000" w:themeFill="accent1" w:val="clear"/>
       </w:tcPr>
     </w:tblStylePr>
     <w:tblStylePr w:type="lastRow">
@@ -11961,7 +11961,7 @@
           <w:insideH w:space="0" w:sz="0" w:val="nil"/>
           <w:insideV w:space="0" w:sz="0" w:val="nil"/>
         </w:tcBorders>
-        <w:shd w:color="auto" w:fill="4f81bd" w:themeFill="accent1" w:val="clear"/>
+        <w:shd w:color="auto" w:fill="000000" w:themeFill="accent1" w:val="clear"/>
       </w:tcPr>
     </w:tblStylePr>
     <w:tblStylePr w:type="lastCol">
@@ -11978,7 +11978,7 @@
           <w:insideH w:space="0" w:sz="0" w:val="nil"/>
           <w:insideV w:space="0" w:sz="0" w:val="nil"/>
         </w:tcBorders>
-        <w:shd w:color="auto" w:fill="4f81bd" w:themeFill="accent1" w:val="clear"/>
+        <w:shd w:color="auto" w:fill="000000" w:themeFill="accent1" w:val="clear"/>
       </w:tcPr>
     </w:tblStylePr>
     <w:tblStylePr w:type="band1Vert">
@@ -12874,8 +12874,8 @@
       <w:tblStyleColBandSize w:val="1"/>
       <w:tblInd w:w="0.0" w:type="dxa"/>
       <w:tblBorders>
-        <w:top w:color="4f81bd" w:space="0" w:sz="8" w:themeColor="accent1" w:val="single"/>
-        <w:bottom w:color="4f81bd" w:space="0" w:sz="8" w:themeColor="accent1" w:val="single"/>
+        <w:top w:color="000000" w:space="0" w:sz="8" w:themeColor="accent1" w:val="single"/>
+        <w:bottom w:color="000000" w:space="0" w:sz="8" w:themeColor="accent1" w:val="single"/>
       </w:tblBorders>
       <w:tblCellMar>
         <w:top w:w="0.0" w:type="dxa"/>
@@ -12892,7 +12892,7 @@
       <w:tcPr>
         <w:tcBorders>
           <w:top w:space="0" w:sz="0" w:val="nil"/>
-          <w:bottom w:color="4f81bd" w:space="0" w:sz="8" w:themeColor="accent1" w:val="single"/>
+          <w:bottom w:color="000000" w:space="0" w:sz="8" w:themeColor="accent1" w:val="single"/>
         </w:tcBorders>
       </w:tcPr>
     </w:tblStylePr>
@@ -12905,8 +12905,8 @@
       <w:tblPr/>
       <w:tcPr>
         <w:tcBorders>
-          <w:top w:color="4f81bd" w:space="0" w:sz="8" w:themeColor="accent1" w:val="single"/>
-          <w:bottom w:color="4f81bd" w:space="0" w:sz="8" w:themeColor="accent1" w:val="single"/>
+          <w:top w:color="000000" w:space="0" w:sz="8" w:themeColor="accent1" w:val="single"/>
+          <w:bottom w:color="000000" w:space="0" w:sz="8" w:themeColor="accent1" w:val="single"/>
         </w:tcBorders>
       </w:tcPr>
     </w:tblStylePr>
@@ -12924,21 +12924,21 @@
       <w:tblPr/>
       <w:tcPr>
         <w:tcBorders>
-          <w:top w:color="4f81bd" w:space="0" w:sz="8" w:themeColor="accent1" w:val="single"/>
-          <w:bottom w:color="4f81bd" w:space="0" w:sz="8" w:themeColor="accent1" w:val="single"/>
+          <w:top w:color="000000" w:space="0" w:sz="8" w:themeColor="accent1" w:val="single"/>
+          <w:bottom w:color="000000" w:space="0" w:sz="8" w:themeColor="accent1" w:val="single"/>
         </w:tcBorders>
       </w:tcPr>
     </w:tblStylePr>
     <w:tblStylePr w:type="band1Vert">
       <w:tblPr/>
       <w:tcPr>
-        <w:shd w:color="auto" w:fill="d3dfee" w:themeFill="accent1" w:themeFillTint="00003F" w:val="clear"/>
+        <w:shd w:color="auto" w:fill="FFFFFF" w:themeFill="accent1" w:themeFillTint="00003F" w:val="clear"/>
       </w:tcPr>
     </w:tblStylePr>
     <w:tblStylePr w:type="band1Horz">
       <w:tblPr/>
       <w:tcPr>
-        <w:shd w:color="auto" w:fill="d3dfee" w:themeFill="accent1" w:themeFillTint="00003F" w:val="clear"/>
+        <w:shd w:color="auto" w:fill="FFFFFF" w:themeFill="accent1" w:themeFillTint="00003F" w:val="clear"/>
       </w:tcPr>
     </w:tblStylePr>
   </w:style>
@@ -13507,10 +13507,10 @@
       <w:tblStyleColBandSize w:val="1"/>
       <w:tblInd w:w="0.0" w:type="dxa"/>
       <w:tblBorders>
-        <w:top w:color="4f81bd" w:space="0" w:sz="8" w:themeColor="accent1" w:val="single"/>
-        <w:left w:color="4f81bd" w:space="0" w:sz="8" w:themeColor="accent1" w:val="single"/>
-        <w:bottom w:color="4f81bd" w:space="0" w:sz="8" w:themeColor="accent1" w:val="single"/>
-        <w:right w:color="4f81bd" w:space="0" w:sz="8" w:themeColor="accent1" w:val="single"/>
+        <w:top w:color="000000" w:space="0" w:sz="8" w:themeColor="accent1" w:val="single"/>
+        <w:left w:color="000000" w:space="0" w:sz="8" w:themeColor="accent1" w:val="single"/>
+        <w:bottom w:color="000000" w:space="0" w:sz="8" w:themeColor="accent1" w:val="single"/>
+        <w:right w:color="000000" w:space="0" w:sz="8" w:themeColor="accent1" w:val="single"/>
       </w:tblBorders>
       <w:tblCellMar>
         <w:top w:w="0.0" w:type="dxa"/>
@@ -13529,7 +13529,7 @@
         <w:tcBorders>
           <w:top w:space="0" w:sz="0" w:val="nil"/>
           <w:left w:space="0" w:sz="0" w:val="nil"/>
-          <w:bottom w:color="4f81bd" w:space="0" w:sz="24" w:themeColor="accent1" w:val="single"/>
+          <w:bottom w:color="000000" w:space="0" w:sz="24" w:themeColor="accent1" w:val="single"/>
           <w:right w:space="0" w:sz="0" w:val="nil"/>
           <w:insideH w:space="0" w:sz="0" w:val="nil"/>
           <w:insideV w:space="0" w:sz="0" w:val="nil"/>
@@ -13541,7 +13541,7 @@
       <w:tblPr/>
       <w:tcPr>
         <w:tcBorders>
-          <w:top w:color="4f81bd" w:space="0" w:sz="8" w:themeColor="accent1" w:val="single"/>
+          <w:top w:color="000000" w:space="0" w:sz="8" w:themeColor="accent1" w:val="single"/>
           <w:left w:space="0" w:sz="0" w:val="nil"/>
           <w:bottom w:space="0" w:sz="0" w:val="nil"/>
           <w:right w:space="0" w:sz="0" w:val="nil"/>
@@ -13558,7 +13558,7 @@
           <w:top w:space="0" w:sz="0" w:val="nil"/>
           <w:left w:space="0" w:sz="0" w:val="nil"/>
           <w:bottom w:space="0" w:sz="0" w:val="nil"/>
-          <w:right w:color="4f81bd" w:space="0" w:sz="8" w:themeColor="accent1" w:val="single"/>
+          <w:right w:color="000000" w:space="0" w:sz="8" w:themeColor="accent1" w:val="single"/>
           <w:insideH w:space="0" w:sz="0" w:val="nil"/>
           <w:insideV w:space="0" w:sz="0" w:val="nil"/>
         </w:tcBorders>
@@ -13570,7 +13570,7 @@
       <w:tcPr>
         <w:tcBorders>
           <w:top w:space="0" w:sz="0" w:val="nil"/>
-          <w:left w:color="4f81bd" w:space="0" w:sz="8" w:themeColor="accent1" w:val="single"/>
+          <w:left w:color="000000" w:space="0" w:sz="8" w:themeColor="accent1" w:val="single"/>
           <w:bottom w:space="0" w:sz="0" w:val="nil"/>
           <w:right w:space="0" w:sz="0" w:val="nil"/>
           <w:insideH w:space="0" w:sz="0" w:val="nil"/>
@@ -13588,7 +13588,7 @@
           <w:insideH w:space="0" w:sz="0" w:val="nil"/>
           <w:insideV w:space="0" w:sz="0" w:val="nil"/>
         </w:tcBorders>
-        <w:shd w:color="auto" w:fill="d3dfee" w:themeFill="accent1" w:themeFillTint="00003F" w:val="clear"/>
+        <w:shd w:color="auto" w:fill="FFFFFF" w:themeFill="accent1" w:themeFillTint="00003F" w:val="clear"/>
       </w:tcPr>
     </w:tblStylePr>
     <w:tblStylePr w:type="band1Horz">
@@ -13600,7 +13600,7 @@
           <w:insideH w:space="0" w:sz="0" w:val="nil"/>
           <w:insideV w:space="0" w:sz="0" w:val="nil"/>
         </w:tcBorders>
-        <w:shd w:color="auto" w:fill="d3dfee" w:themeFill="accent1" w:themeFillTint="00003F" w:val="clear"/>
+        <w:shd w:color="auto" w:fill="FFFFFF" w:themeFill="accent1" w:themeFillTint="00003F" w:val="clear"/>
       </w:tcPr>
     </w:tblStylePr>
     <w:tblStylePr w:type="nwCell">
@@ -14359,7 +14359,7 @@
       </w:tblCellMar>
     </w:tblPr>
     <w:tcPr>
-      <w:shd w:color="auto" w:fill="d3dfee" w:themeFill="accent1" w:themeFillTint="00003F" w:val="clear"/>
+      <w:shd w:color="auto" w:fill="FFFFFF" w:themeFill="accent1" w:themeFillTint="00003F" w:val="clear"/>
     </w:tcPr>
     <w:tblStylePr w:type="firstRow">
       <w:rPr>
@@ -14911,12 +14911,12 @@
       <w:tblStyleColBandSize w:val="1"/>
       <w:tblInd w:w="0.0" w:type="dxa"/>
       <w:tblBorders>
-        <w:top w:color="4f81bd" w:space="0" w:sz="8" w:themeColor="accent1" w:val="single"/>
-        <w:left w:color="4f81bd" w:space="0" w:sz="8" w:themeColor="accent1" w:val="single"/>
-        <w:bottom w:color="4f81bd" w:space="0" w:sz="8" w:themeColor="accent1" w:val="single"/>
-        <w:right w:color="4f81bd" w:space="0" w:sz="8" w:themeColor="accent1" w:val="single"/>
-        <w:insideH w:color="4f81bd" w:space="0" w:sz="8" w:themeColor="accent1" w:val="single"/>
-        <w:insideV w:color="4f81bd" w:space="0" w:sz="8" w:themeColor="accent1" w:val="single"/>
+        <w:top w:color="000000" w:space="0" w:sz="8" w:themeColor="accent1" w:val="single"/>
+        <w:left w:color="000000" w:space="0" w:sz="8" w:themeColor="accent1" w:val="single"/>
+        <w:bottom w:color="000000" w:space="0" w:sz="8" w:themeColor="accent1" w:val="single"/>
+        <w:right w:color="000000" w:space="0" w:sz="8" w:themeColor="accent1" w:val="single"/>
+        <w:insideH w:color="000000" w:space="0" w:sz="8" w:themeColor="accent1" w:val="single"/>
+        <w:insideV w:color="000000" w:space="0" w:sz="8" w:themeColor="accent1" w:val="single"/>
       </w:tblBorders>
       <w:tblCellMar>
         <w:top w:w="0.0" w:type="dxa"/>
@@ -14926,7 +14926,7 @@
       </w:tblCellMar>
     </w:tblPr>
     <w:tcPr>
-      <w:shd w:color="auto" w:fill="d3dfee" w:themeFill="accent1" w:themeFillTint="00003F" w:val="clear"/>
+      <w:shd w:color="auto" w:fill="FFFFFF" w:themeFill="accent1" w:themeFillTint="00003F" w:val="clear"/>
     </w:tcPr>
     <w:tblStylePr w:type="firstRow">
       <w:rPr>
@@ -15006,8 +15006,8 @@
       <w:tblPr/>
       <w:tcPr>
         <w:tcBorders>
-          <w:insideH w:color="4f81bd" w:space="0" w:sz="6" w:themeColor="accent1" w:val="single"/>
-          <w:insideV w:color="4f81bd" w:space="0" w:sz="6" w:themeColor="accent1" w:val="single"/>
+          <w:insideH w:color="000000" w:space="0" w:sz="6" w:themeColor="accent1" w:val="single"/>
+          <w:insideV w:color="000000" w:space="0" w:sz="6" w:themeColor="accent1" w:val="single"/>
         </w:tcBorders>
         <w:shd w:color="auto" w:fill="a7bfde" w:themeFill="accent1" w:themeFillTint="00007F" w:val="clear"/>
       </w:tcPr>
@@ -15813,7 +15813,7 @@
       </w:tblCellMar>
     </w:tblPr>
     <w:tcPr>
-      <w:shd w:color="auto" w:fill="d3dfee" w:themeFill="accent1" w:themeFillTint="00003F" w:val="clear"/>
+      <w:shd w:color="auto" w:fill="FFFFFF" w:themeFill="accent1" w:themeFillTint="00003F" w:val="clear"/>
     </w:tcPr>
     <w:tblStylePr w:type="firstRow">
       <w:rPr>
@@ -15833,7 +15833,7 @@
           <w:insideH w:space="0" w:sz="0" w:val="nil"/>
           <w:insideV w:color="ffffff" w:space="0" w:sz="8" w:themeColor="background1" w:val="single"/>
         </w:tcBorders>
-        <w:shd w:color="auto" w:fill="4f81bd" w:themeFill="accent1" w:val="clear"/>
+        <w:shd w:color="auto" w:fill="000000" w:themeFill="accent1" w:val="clear"/>
       </w:tcPr>
     </w:tblStylePr>
     <w:tblStylePr w:type="lastRow">
@@ -15854,7 +15854,7 @@
           <w:insideH w:space="0" w:sz="0" w:val="nil"/>
           <w:insideV w:color="ffffff" w:space="0" w:sz="8" w:themeColor="background1" w:val="single"/>
         </w:tcBorders>
-        <w:shd w:color="auto" w:fill="4f81bd" w:themeFill="accent1" w:val="clear"/>
+        <w:shd w:color="auto" w:fill="000000" w:themeFill="accent1" w:val="clear"/>
       </w:tcPr>
     </w:tblStylePr>
     <w:tblStylePr w:type="firstCol">
@@ -15873,7 +15873,7 @@
           <w:insideH w:space="0" w:sz="0" w:val="nil"/>
           <w:insideV w:space="0" w:sz="0" w:val="nil"/>
         </w:tcBorders>
-        <w:shd w:color="auto" w:fill="4f81bd" w:themeFill="accent1" w:val="clear"/>
+        <w:shd w:color="auto" w:fill="000000" w:themeFill="accent1" w:val="clear"/>
       </w:tcPr>
     </w:tblStylePr>
     <w:tblStylePr w:type="lastCol">
@@ -15894,7 +15894,7 @@
           <w:insideH w:space="0" w:sz="0" w:val="nil"/>
           <w:insideV w:space="0" w:sz="0" w:val="nil"/>
         </w:tcBorders>
-        <w:shd w:color="auto" w:fill="4f81bd" w:themeFill="accent1" w:val="clear"/>
+        <w:shd w:color="auto" w:fill="000000" w:themeFill="accent1" w:val="clear"/>
       </w:tcPr>
     </w:tblStylePr>
     <w:tblStylePr w:type="band1Vert">
@@ -16768,7 +16768,7 @@
       </w:tblCellMar>
     </w:tblPr>
     <w:tcPr>
-      <w:shd w:color="auto" w:fill="4f81bd" w:themeFill="accent1" w:val="clear"/>
+      <w:shd w:color="auto" w:fill="000000" w:themeFill="accent1" w:val="clear"/>
     </w:tcPr>
     <w:tblStylePr w:type="firstRow">
       <w:rPr>
@@ -17568,9 +17568,9 @@
       <w:tblInd w:w="0.0" w:type="dxa"/>
       <w:tblBorders>
         <w:top w:color="c0504d" w:space="0" w:sz="24" w:themeColor="accent2" w:val="single"/>
-        <w:left w:color="4f81bd" w:space="0" w:sz="4" w:themeColor="accent1" w:val="single"/>
-        <w:bottom w:color="4f81bd" w:space="0" w:sz="4" w:themeColor="accent1" w:val="single"/>
-        <w:right w:color="4f81bd" w:space="0" w:sz="4" w:themeColor="accent1" w:val="single"/>
+        <w:left w:color="000000" w:space="0" w:sz="4" w:themeColor="accent1" w:val="single"/>
+        <w:bottom w:color="000000" w:space="0" w:sz="4" w:themeColor="accent1" w:val="single"/>
+        <w:right w:color="000000" w:space="0" w:sz="4" w:themeColor="accent1" w:val="single"/>
         <w:insideH w:color="ffffff" w:space="0" w:sz="4" w:themeColor="background1" w:val="single"/>
         <w:insideV w:color="ffffff" w:space="0" w:sz="4" w:themeColor="background1" w:val="single"/>
       </w:tblBorders>
@@ -18435,7 +18435,7 @@
           <w:insideH w:space="0" w:sz="0" w:val="nil"/>
           <w:insideV w:space="0" w:sz="0" w:val="nil"/>
         </w:tcBorders>
-        <w:shd w:color="auto" w:fill="d3dfee" w:themeFill="accent1" w:themeFillTint="00003F" w:val="clear"/>
+        <w:shd w:color="auto" w:fill="FFFFFF" w:themeFill="accent1" w:themeFillTint="00003F" w:val="clear"/>
       </w:tcPr>
     </w:tblStylePr>
     <w:tblStylePr w:type="band1Horz">
@@ -19444,7 +19444,7 @@
       <w:rFonts w:ascii="Calibri" w:cs="Calibri" w:eastAsia="Calibri" w:hAnsi="Calibri"/>
       <w:i w:val="1"/>
       <w:iCs w:val="1"/>
-      <w:color w:val="4f81bd"/>
+      <w:color w:val="000000"/>
       <w:sz w:val="24"/>
       <w:szCs w:val="24"/>
     </w:rPr>
@@ -19467,34 +19467,34 @@
     <w:tblStylePr w:type="band1Horz">
       <w:tcPr>
         <w:tcBorders>
-          <w:top w:color="4f81bd" w:space="0" w:sz="8" w:val="single"/>
-          <w:left w:color="4f81bd" w:space="0" w:sz="8" w:val="single"/>
-          <w:bottom w:color="4f81bd" w:space="0" w:sz="8" w:val="single"/>
-          <w:right w:color="4f81bd" w:space="0" w:sz="8" w:val="single"/>
-          <w:insideV w:color="4f81bd" w:space="0" w:sz="8" w:val="single"/>
-        </w:tcBorders>
-        <w:shd w:fill="d3dfee" w:val="clear"/>
+          <w:top w:color="000000" w:space="0" w:sz="8" w:val="single"/>
+          <w:left w:color="000000" w:space="0" w:sz="8" w:val="single"/>
+          <w:bottom w:color="000000" w:space="0" w:sz="8" w:val="single"/>
+          <w:right w:color="000000" w:space="0" w:sz="8" w:val="single"/>
+          <w:insideV w:color="000000" w:space="0" w:sz="8" w:val="single"/>
+        </w:tcBorders>
+        <w:shd w:fill="FFFFFF" w:val="clear"/>
       </w:tcPr>
     </w:tblStylePr>
     <w:tblStylePr w:type="band1Vert">
       <w:tcPr>
         <w:tcBorders>
-          <w:top w:color="4f81bd" w:space="0" w:sz="8" w:val="single"/>
-          <w:left w:color="4f81bd" w:space="0" w:sz="8" w:val="single"/>
-          <w:bottom w:color="4f81bd" w:space="0" w:sz="8" w:val="single"/>
-          <w:right w:color="4f81bd" w:space="0" w:sz="8" w:val="single"/>
-        </w:tcBorders>
-        <w:shd w:fill="d3dfee" w:val="clear"/>
+          <w:top w:color="000000" w:space="0" w:sz="8" w:val="single"/>
+          <w:left w:color="000000" w:space="0" w:sz="8" w:val="single"/>
+          <w:bottom w:color="000000" w:space="0" w:sz="8" w:val="single"/>
+          <w:right w:color="000000" w:space="0" w:sz="8" w:val="single"/>
+        </w:tcBorders>
+        <w:shd w:fill="FFFFFF" w:val="clear"/>
       </w:tcPr>
     </w:tblStylePr>
     <w:tblStylePr w:type="band2Horz">
       <w:tcPr>
         <w:tcBorders>
-          <w:top w:color="4f81bd" w:space="0" w:sz="8" w:val="single"/>
-          <w:left w:color="4f81bd" w:space="0" w:sz="8" w:val="single"/>
-          <w:bottom w:color="4f81bd" w:space="0" w:sz="8" w:val="single"/>
-          <w:right w:color="4f81bd" w:space="0" w:sz="8" w:val="single"/>
-          <w:insideV w:color="4f81bd" w:space="0" w:sz="8" w:val="single"/>
+          <w:top w:color="000000" w:space="0" w:sz="8" w:val="single"/>
+          <w:left w:color="000000" w:space="0" w:sz="8" w:val="single"/>
+          <w:bottom w:color="000000" w:space="0" w:sz="8" w:val="single"/>
+          <w:right w:color="000000" w:space="0" w:sz="8" w:val="single"/>
+          <w:insideV w:color="000000" w:space="0" w:sz="8" w:val="single"/>
         </w:tcBorders>
       </w:tcPr>
     </w:tblStylePr>
@@ -19516,12 +19516,12 @@
       </w:rPr>
       <w:tcPr>
         <w:tcBorders>
-          <w:top w:color="4f81bd" w:space="0" w:sz="8" w:val="single"/>
-          <w:left w:color="4f81bd" w:space="0" w:sz="8" w:val="single"/>
-          <w:bottom w:color="4f81bd" w:space="0" w:sz="18" w:val="single"/>
-          <w:right w:color="4f81bd" w:space="0" w:sz="8" w:val="single"/>
+          <w:top w:color="000000" w:space="0" w:sz="8" w:val="single"/>
+          <w:left w:color="000000" w:space="0" w:sz="8" w:val="single"/>
+          <w:bottom w:color="000000" w:space="0" w:sz="18" w:val="single"/>
+          <w:right w:color="000000" w:space="0" w:sz="8" w:val="single"/>
           <w:insideH w:color="000000" w:space="0" w:sz="0" w:val="nil"/>
-          <w:insideV w:color="4f81bd" w:space="0" w:sz="8" w:val="single"/>
+          <w:insideV w:color="000000" w:space="0" w:sz="8" w:val="single"/>
         </w:tcBorders>
       </w:tcPr>
     </w:tblStylePr>
@@ -19533,10 +19533,10 @@
       </w:rPr>
       <w:tcPr>
         <w:tcBorders>
-          <w:top w:color="4f81bd" w:space="0" w:sz="8" w:val="single"/>
-          <w:left w:color="4f81bd" w:space="0" w:sz="8" w:val="single"/>
-          <w:bottom w:color="4f81bd" w:space="0" w:sz="8" w:val="single"/>
-          <w:right w:color="4f81bd" w:space="0" w:sz="8" w:val="single"/>
+          <w:top w:color="000000" w:space="0" w:sz="8" w:val="single"/>
+          <w:left w:color="000000" w:space="0" w:sz="8" w:val="single"/>
+          <w:bottom w:color="000000" w:space="0" w:sz="8" w:val="single"/>
+          <w:right w:color="000000" w:space="0" w:sz="8" w:val="single"/>
         </w:tcBorders>
       </w:tcPr>
     </w:tblStylePr>
@@ -19551,12 +19551,12 @@
       </w:rPr>
       <w:tcPr>
         <w:tcBorders>
-          <w:top w:color="4f81bd" w:space="0" w:sz="6" w:val="single"/>
-          <w:left w:color="4f81bd" w:space="0" w:sz="8" w:val="single"/>
-          <w:bottom w:color="4f81bd" w:space="0" w:sz="8" w:val="single"/>
-          <w:right w:color="4f81bd" w:space="0" w:sz="8" w:val="single"/>
+          <w:top w:color="000000" w:space="0" w:sz="6" w:val="single"/>
+          <w:left w:color="000000" w:space="0" w:sz="8" w:val="single"/>
+          <w:bottom w:color="000000" w:space="0" w:sz="8" w:val="single"/>
+          <w:right w:color="000000" w:space="0" w:sz="8" w:val="single"/>
           <w:insideH w:color="000000" w:space="0" w:sz="0" w:val="nil"/>
-          <w:insideV w:color="4f81bd" w:space="0" w:sz="8" w:val="single"/>
+          <w:insideV w:color="000000" w:space="0" w:sz="8" w:val="single"/>
         </w:tcBorders>
       </w:tcPr>
     </w:tblStylePr>
@@ -19579,34 +19579,34 @@
     <w:tblStylePr w:type="band1Horz">
       <w:tcPr>
         <w:tcBorders>
-          <w:top w:color="4f81bd" w:space="0" w:sz="8" w:val="single"/>
-          <w:left w:color="4f81bd" w:space="0" w:sz="8" w:val="single"/>
-          <w:bottom w:color="4f81bd" w:space="0" w:sz="8" w:val="single"/>
-          <w:right w:color="4f81bd" w:space="0" w:sz="8" w:val="single"/>
-          <w:insideV w:color="4f81bd" w:space="0" w:sz="8" w:val="single"/>
-        </w:tcBorders>
-        <w:shd w:fill="d3dfee" w:val="clear"/>
+          <w:top w:color="000000" w:space="0" w:sz="8" w:val="single"/>
+          <w:left w:color="000000" w:space="0" w:sz="8" w:val="single"/>
+          <w:bottom w:color="000000" w:space="0" w:sz="8" w:val="single"/>
+          <w:right w:color="000000" w:space="0" w:sz="8" w:val="single"/>
+          <w:insideV w:color="000000" w:space="0" w:sz="8" w:val="single"/>
+        </w:tcBorders>
+        <w:shd w:fill="FFFFFF" w:val="clear"/>
       </w:tcPr>
     </w:tblStylePr>
     <w:tblStylePr w:type="band1Vert">
       <w:tcPr>
         <w:tcBorders>
-          <w:top w:color="4f81bd" w:space="0" w:sz="8" w:val="single"/>
-          <w:left w:color="4f81bd" w:space="0" w:sz="8" w:val="single"/>
-          <w:bottom w:color="4f81bd" w:space="0" w:sz="8" w:val="single"/>
-          <w:right w:color="4f81bd" w:space="0" w:sz="8" w:val="single"/>
-        </w:tcBorders>
-        <w:shd w:fill="d3dfee" w:val="clear"/>
+          <w:top w:color="000000" w:space="0" w:sz="8" w:val="single"/>
+          <w:left w:color="000000" w:space="0" w:sz="8" w:val="single"/>
+          <w:bottom w:color="000000" w:space="0" w:sz="8" w:val="single"/>
+          <w:right w:color="000000" w:space="0" w:sz="8" w:val="single"/>
+        </w:tcBorders>
+        <w:shd w:fill="FFFFFF" w:val="clear"/>
       </w:tcPr>
     </w:tblStylePr>
     <w:tblStylePr w:type="band2Horz">
       <w:tcPr>
         <w:tcBorders>
-          <w:top w:color="4f81bd" w:space="0" w:sz="8" w:val="single"/>
-          <w:left w:color="4f81bd" w:space="0" w:sz="8" w:val="single"/>
-          <w:bottom w:color="4f81bd" w:space="0" w:sz="8" w:val="single"/>
-          <w:right w:color="4f81bd" w:space="0" w:sz="8" w:val="single"/>
-          <w:insideV w:color="4f81bd" w:space="0" w:sz="8" w:val="single"/>
+          <w:top w:color="000000" w:space="0" w:sz="8" w:val="single"/>
+          <w:left w:color="000000" w:space="0" w:sz="8" w:val="single"/>
+          <w:bottom w:color="000000" w:space="0" w:sz="8" w:val="single"/>
+          <w:right w:color="000000" w:space="0" w:sz="8" w:val="single"/>
+          <w:insideV w:color="000000" w:space="0" w:sz="8" w:val="single"/>
         </w:tcBorders>
       </w:tcPr>
     </w:tblStylePr>
@@ -19628,12 +19628,12 @@
       </w:rPr>
       <w:tcPr>
         <w:tcBorders>
-          <w:top w:color="4f81bd" w:space="0" w:sz="8" w:val="single"/>
-          <w:left w:color="4f81bd" w:space="0" w:sz="8" w:val="single"/>
-          <w:bottom w:color="4f81bd" w:space="0" w:sz="18" w:val="single"/>
-          <w:right w:color="4f81bd" w:space="0" w:sz="8" w:val="single"/>
+          <w:top w:color="000000" w:space="0" w:sz="8" w:val="single"/>
+          <w:left w:color="000000" w:space="0" w:sz="8" w:val="single"/>
+          <w:bottom w:color="000000" w:space="0" w:sz="18" w:val="single"/>
+          <w:right w:color="000000" w:space="0" w:sz="8" w:val="single"/>
           <w:insideH w:color="000000" w:space="0" w:sz="0" w:val="nil"/>
-          <w:insideV w:color="4f81bd" w:space="0" w:sz="8" w:val="single"/>
+          <w:insideV w:color="000000" w:space="0" w:sz="8" w:val="single"/>
         </w:tcBorders>
       </w:tcPr>
     </w:tblStylePr>
@@ -19645,10 +19645,10 @@
       </w:rPr>
       <w:tcPr>
         <w:tcBorders>
-          <w:top w:color="4f81bd" w:space="0" w:sz="8" w:val="single"/>
-          <w:left w:color="4f81bd" w:space="0" w:sz="8" w:val="single"/>
-          <w:bottom w:color="4f81bd" w:space="0" w:sz="8" w:val="single"/>
-          <w:right w:color="4f81bd" w:space="0" w:sz="8" w:val="single"/>
+          <w:top w:color="000000" w:space="0" w:sz="8" w:val="single"/>
+          <w:left w:color="000000" w:space="0" w:sz="8" w:val="single"/>
+          <w:bottom w:color="000000" w:space="0" w:sz="8" w:val="single"/>
+          <w:right w:color="000000" w:space="0" w:sz="8" w:val="single"/>
         </w:tcBorders>
       </w:tcPr>
     </w:tblStylePr>
@@ -19663,12 +19663,12 @@
       </w:rPr>
       <w:tcPr>
         <w:tcBorders>
-          <w:top w:color="4f81bd" w:space="0" w:sz="6" w:val="single"/>
-          <w:left w:color="4f81bd" w:space="0" w:sz="8" w:val="single"/>
-          <w:bottom w:color="4f81bd" w:space="0" w:sz="8" w:val="single"/>
-          <w:right w:color="4f81bd" w:space="0" w:sz="8" w:val="single"/>
+          <w:top w:color="000000" w:space="0" w:sz="6" w:val="single"/>
+          <w:left w:color="000000" w:space="0" w:sz="8" w:val="single"/>
+          <w:bottom w:color="000000" w:space="0" w:sz="8" w:val="single"/>
+          <w:right w:color="000000" w:space="0" w:sz="8" w:val="single"/>
           <w:insideH w:color="000000" w:space="0" w:sz="0" w:val="nil"/>
-          <w:insideV w:color="4f81bd" w:space="0" w:sz="8" w:val="single"/>
+          <w:insideV w:color="000000" w:space="0" w:sz="8" w:val="single"/>
         </w:tcBorders>
       </w:tcPr>
     </w:tblStylePr>
@@ -19691,34 +19691,34 @@
     <w:tblStylePr w:type="band1Horz">
       <w:tcPr>
         <w:tcBorders>
-          <w:top w:color="4f81bd" w:space="0" w:sz="8" w:val="single"/>
-          <w:left w:color="4f81bd" w:space="0" w:sz="8" w:val="single"/>
-          <w:bottom w:color="4f81bd" w:space="0" w:sz="8" w:val="single"/>
-          <w:right w:color="4f81bd" w:space="0" w:sz="8" w:val="single"/>
-          <w:insideV w:color="4f81bd" w:space="0" w:sz="8" w:val="single"/>
-        </w:tcBorders>
-        <w:shd w:fill="d3dfee" w:val="clear"/>
+          <w:top w:color="000000" w:space="0" w:sz="8" w:val="single"/>
+          <w:left w:color="000000" w:space="0" w:sz="8" w:val="single"/>
+          <w:bottom w:color="000000" w:space="0" w:sz="8" w:val="single"/>
+          <w:right w:color="000000" w:space="0" w:sz="8" w:val="single"/>
+          <w:insideV w:color="000000" w:space="0" w:sz="8" w:val="single"/>
+        </w:tcBorders>
+        <w:shd w:fill="FFFFFF" w:val="clear"/>
       </w:tcPr>
     </w:tblStylePr>
     <w:tblStylePr w:type="band1Vert">
       <w:tcPr>
         <w:tcBorders>
-          <w:top w:color="4f81bd" w:space="0" w:sz="8" w:val="single"/>
-          <w:left w:color="4f81bd" w:space="0" w:sz="8" w:val="single"/>
-          <w:bottom w:color="4f81bd" w:space="0" w:sz="8" w:val="single"/>
-          <w:right w:color="4f81bd" w:space="0" w:sz="8" w:val="single"/>
-        </w:tcBorders>
-        <w:shd w:fill="d3dfee" w:val="clear"/>
+          <w:top w:color="000000" w:space="0" w:sz="8" w:val="single"/>
+          <w:left w:color="000000" w:space="0" w:sz="8" w:val="single"/>
+          <w:bottom w:color="000000" w:space="0" w:sz="8" w:val="single"/>
+          <w:right w:color="000000" w:space="0" w:sz="8" w:val="single"/>
+        </w:tcBorders>
+        <w:shd w:fill="FFFFFF" w:val="clear"/>
       </w:tcPr>
     </w:tblStylePr>
     <w:tblStylePr w:type="band2Horz">
       <w:tcPr>
         <w:tcBorders>
-          <w:top w:color="4f81bd" w:space="0" w:sz="8" w:val="single"/>
-          <w:left w:color="4f81bd" w:space="0" w:sz="8" w:val="single"/>
-          <w:bottom w:color="4f81bd" w:space="0" w:sz="8" w:val="single"/>
-          <w:right w:color="4f81bd" w:space="0" w:sz="8" w:val="single"/>
-          <w:insideV w:color="4f81bd" w:space="0" w:sz="8" w:val="single"/>
+          <w:top w:color="000000" w:space="0" w:sz="8" w:val="single"/>
+          <w:left w:color="000000" w:space="0" w:sz="8" w:val="single"/>
+          <w:bottom w:color="000000" w:space="0" w:sz="8" w:val="single"/>
+          <w:right w:color="000000" w:space="0" w:sz="8" w:val="single"/>
+          <w:insideV w:color="000000" w:space="0" w:sz="8" w:val="single"/>
         </w:tcBorders>
       </w:tcPr>
     </w:tblStylePr>
@@ -19740,12 +19740,12 @@
       </w:rPr>
       <w:tcPr>
         <w:tcBorders>
-          <w:top w:color="4f81bd" w:space="0" w:sz="8" w:val="single"/>
-          <w:left w:color="4f81bd" w:space="0" w:sz="8" w:val="single"/>
-          <w:bottom w:color="4f81bd" w:space="0" w:sz="18" w:val="single"/>
-          <w:right w:color="4f81bd" w:space="0" w:sz="8" w:val="single"/>
+          <w:top w:color="000000" w:space="0" w:sz="8" w:val="single"/>
+          <w:left w:color="000000" w:space="0" w:sz="8" w:val="single"/>
+          <w:bottom w:color="000000" w:space="0" w:sz="18" w:val="single"/>
+          <w:right w:color="000000" w:space="0" w:sz="8" w:val="single"/>
           <w:insideH w:color="000000" w:space="0" w:sz="0" w:val="nil"/>
-          <w:insideV w:color="4f81bd" w:space="0" w:sz="8" w:val="single"/>
+          <w:insideV w:color="000000" w:space="0" w:sz="8" w:val="single"/>
         </w:tcBorders>
       </w:tcPr>
     </w:tblStylePr>
@@ -19757,10 +19757,10 @@
       </w:rPr>
       <w:tcPr>
         <w:tcBorders>
-          <w:top w:color="4f81bd" w:space="0" w:sz="8" w:val="single"/>
-          <w:left w:color="4f81bd" w:space="0" w:sz="8" w:val="single"/>
-          <w:bottom w:color="4f81bd" w:space="0" w:sz="8" w:val="single"/>
-          <w:right w:color="4f81bd" w:space="0" w:sz="8" w:val="single"/>
+          <w:top w:color="000000" w:space="0" w:sz="8" w:val="single"/>
+          <w:left w:color="000000" w:space="0" w:sz="8" w:val="single"/>
+          <w:bottom w:color="000000" w:space="0" w:sz="8" w:val="single"/>
+          <w:right w:color="000000" w:space="0" w:sz="8" w:val="single"/>
         </w:tcBorders>
       </w:tcPr>
     </w:tblStylePr>
@@ -19775,12 +19775,12 @@
       </w:rPr>
       <w:tcPr>
         <w:tcBorders>
-          <w:top w:color="4f81bd" w:space="0" w:sz="6" w:val="single"/>
-          <w:left w:color="4f81bd" w:space="0" w:sz="8" w:val="single"/>
-          <w:bottom w:color="4f81bd" w:space="0" w:sz="8" w:val="single"/>
-          <w:right w:color="4f81bd" w:space="0" w:sz="8" w:val="single"/>
+          <w:top w:color="000000" w:space="0" w:sz="6" w:val="single"/>
+          <w:left w:color="000000" w:space="0" w:sz="8" w:val="single"/>
+          <w:bottom w:color="000000" w:space="0" w:sz="8" w:val="single"/>
+          <w:right w:color="000000" w:space="0" w:sz="8" w:val="single"/>
           <w:insideH w:color="000000" w:space="0" w:sz="0" w:val="nil"/>
-          <w:insideV w:color="4f81bd" w:space="0" w:sz="8" w:val="single"/>
+          <w:insideV w:color="000000" w:space="0" w:sz="8" w:val="single"/>
         </w:tcBorders>
       </w:tcPr>
     </w:tblStylePr>
@@ -19803,34 +19803,34 @@
     <w:tblStylePr w:type="band1Horz">
       <w:tcPr>
         <w:tcBorders>
-          <w:top w:color="4f81bd" w:space="0" w:sz="8" w:val="single"/>
-          <w:left w:color="4f81bd" w:space="0" w:sz="8" w:val="single"/>
-          <w:bottom w:color="4f81bd" w:space="0" w:sz="8" w:val="single"/>
-          <w:right w:color="4f81bd" w:space="0" w:sz="8" w:val="single"/>
-          <w:insideV w:color="4f81bd" w:space="0" w:sz="8" w:val="single"/>
-        </w:tcBorders>
-        <w:shd w:fill="d3dfee" w:val="clear"/>
+          <w:top w:color="000000" w:space="0" w:sz="8" w:val="single"/>
+          <w:left w:color="000000" w:space="0" w:sz="8" w:val="single"/>
+          <w:bottom w:color="000000" w:space="0" w:sz="8" w:val="single"/>
+          <w:right w:color="000000" w:space="0" w:sz="8" w:val="single"/>
+          <w:insideV w:color="000000" w:space="0" w:sz="8" w:val="single"/>
+        </w:tcBorders>
+        <w:shd w:fill="FFFFFF" w:val="clear"/>
       </w:tcPr>
     </w:tblStylePr>
     <w:tblStylePr w:type="band1Vert">
       <w:tcPr>
         <w:tcBorders>
-          <w:top w:color="4f81bd" w:space="0" w:sz="8" w:val="single"/>
-          <w:left w:color="4f81bd" w:space="0" w:sz="8" w:val="single"/>
-          <w:bottom w:color="4f81bd" w:space="0" w:sz="8" w:val="single"/>
-          <w:right w:color="4f81bd" w:space="0" w:sz="8" w:val="single"/>
-        </w:tcBorders>
-        <w:shd w:fill="d3dfee" w:val="clear"/>
+          <w:top w:color="000000" w:space="0" w:sz="8" w:val="single"/>
+          <w:left w:color="000000" w:space="0" w:sz="8" w:val="single"/>
+          <w:bottom w:color="000000" w:space="0" w:sz="8" w:val="single"/>
+          <w:right w:color="000000" w:space="0" w:sz="8" w:val="single"/>
+        </w:tcBorders>
+        <w:shd w:fill="FFFFFF" w:val="clear"/>
       </w:tcPr>
     </w:tblStylePr>
     <w:tblStylePr w:type="band2Horz">
       <w:tcPr>
         <w:tcBorders>
-          <w:top w:color="4f81bd" w:space="0" w:sz="8" w:val="single"/>
-          <w:left w:color="4f81bd" w:space="0" w:sz="8" w:val="single"/>
-          <w:bottom w:color="4f81bd" w:space="0" w:sz="8" w:val="single"/>
-          <w:right w:color="4f81bd" w:space="0" w:sz="8" w:val="single"/>
-          <w:insideV w:color="4f81bd" w:space="0" w:sz="8" w:val="single"/>
+          <w:top w:color="000000" w:space="0" w:sz="8" w:val="single"/>
+          <w:left w:color="000000" w:space="0" w:sz="8" w:val="single"/>
+          <w:bottom w:color="000000" w:space="0" w:sz="8" w:val="single"/>
+          <w:right w:color="000000" w:space="0" w:sz="8" w:val="single"/>
+          <w:insideV w:color="000000" w:space="0" w:sz="8" w:val="single"/>
         </w:tcBorders>
       </w:tcPr>
     </w:tblStylePr>
@@ -19852,12 +19852,12 @@
       </w:rPr>
       <w:tcPr>
         <w:tcBorders>
-          <w:top w:color="4f81bd" w:space="0" w:sz="8" w:val="single"/>
-          <w:left w:color="4f81bd" w:space="0" w:sz="8" w:val="single"/>
-          <w:bottom w:color="4f81bd" w:space="0" w:sz="18" w:val="single"/>
-          <w:right w:color="4f81bd" w:space="0" w:sz="8" w:val="single"/>
+          <w:top w:color="000000" w:space="0" w:sz="8" w:val="single"/>
+          <w:left w:color="000000" w:space="0" w:sz="8" w:val="single"/>
+          <w:bottom w:color="000000" w:space="0" w:sz="18" w:val="single"/>
+          <w:right w:color="000000" w:space="0" w:sz="8" w:val="single"/>
           <w:insideH w:color="000000" w:space="0" w:sz="0" w:val="nil"/>
-          <w:insideV w:color="4f81bd" w:space="0" w:sz="8" w:val="single"/>
+          <w:insideV w:color="000000" w:space="0" w:sz="8" w:val="single"/>
         </w:tcBorders>
       </w:tcPr>
     </w:tblStylePr>
@@ -19869,10 +19869,10 @@
       </w:rPr>
       <w:tcPr>
         <w:tcBorders>
-          <w:top w:color="4f81bd" w:space="0" w:sz="8" w:val="single"/>
-          <w:left w:color="4f81bd" w:space="0" w:sz="8" w:val="single"/>
-          <w:bottom w:color="4f81bd" w:space="0" w:sz="8" w:val="single"/>
-          <w:right w:color="4f81bd" w:space="0" w:sz="8" w:val="single"/>
+          <w:top w:color="000000" w:space="0" w:sz="8" w:val="single"/>
+          <w:left w:color="000000" w:space="0" w:sz="8" w:val="single"/>
+          <w:bottom w:color="000000" w:space="0" w:sz="8" w:val="single"/>
+          <w:right w:color="000000" w:space="0" w:sz="8" w:val="single"/>
         </w:tcBorders>
       </w:tcPr>
     </w:tblStylePr>
@@ -19887,12 +19887,12 @@
       </w:rPr>
       <w:tcPr>
         <w:tcBorders>
-          <w:top w:color="4f81bd" w:space="0" w:sz="6" w:val="single"/>
-          <w:left w:color="4f81bd" w:space="0" w:sz="8" w:val="single"/>
-          <w:bottom w:color="4f81bd" w:space="0" w:sz="8" w:val="single"/>
-          <w:right w:color="4f81bd" w:space="0" w:sz="8" w:val="single"/>
+          <w:top w:color="000000" w:space="0" w:sz="6" w:val="single"/>
+          <w:left w:color="000000" w:space="0" w:sz="8" w:val="single"/>
+          <w:bottom w:color="000000" w:space="0" w:sz="8" w:val="single"/>
+          <w:right w:color="000000" w:space="0" w:sz="8" w:val="single"/>
           <w:insideH w:color="000000" w:space="0" w:sz="0" w:val="nil"/>
-          <w:insideV w:color="4f81bd" w:space="0" w:sz="8" w:val="single"/>
+          <w:insideV w:color="000000" w:space="0" w:sz="8" w:val="single"/>
         </w:tcBorders>
       </w:tcPr>
     </w:tblStylePr>

</xml_diff>